<commit_message>
Right-align the header label and address the letter to Daniel Millar
Header now places the CMD Consulting label on a right tab stop, matching the
x position the kit footer already uses for the page number, with the logo
staying left. Built as a local header in build_letter.js rather than by
editing styles/cmd_docx_styles_final.js, so the shared kit is unchanged for
other documents.

Addressee set to Daniel Millar; salutation reads "Dear Daniel," to avoid
assuming a courtesy title. Recipient title and the signatory block remain
placeholders. Re-rendered and still two pages.

Co-Authored-By: Claude Opus 5 <noreply@anthropic.com>
Claude-Session: https://claude.ai/code/session_01DEDRoby29mYZsTUgVwuDAG
</commit_message>
<xml_diff>
--- a/syama-ore-sorting/brief/Syama_Ore_Sorting_Letter.docx
+++ b/syama-ore-sorting/brief/Syama_Ore_Sorting_Letter.docx
@@ -31,7 +31,7 @@
           <w:sz w:val="22"/>
           <w:szCs w:val="22"/>
         </w:rPr>
-        <w:t xml:space="preserve">[Recipient Name]</w:t>
+        <w:t xml:space="preserve">Daniel Millar</w:t>
       </w:r>
     </w:p>
     <w:p>
@@ -91,7 +91,7 @@
           <w:sz w:val="22"/>
           <w:szCs w:val="22"/>
         </w:rPr>
-        <w:t xml:space="preserve">Dear [Recipient Name],</w:t>
+        <w:t xml:space="preserve">Dear Daniel,</w:t>
       </w:r>
     </w:p>
     <w:p>
@@ -1746,6 +1746,9 @@
       <w:pBdr>
         <w:bottom w:val="single" w:color="4E57A6" w:sz="6" w:space="4"/>
       </w:pBdr>
+      <w:tabs>
+        <w:tab w:val="right" w:pos="9026"/>
+      </w:tabs>
       <w:spacing w:after="200"/>
     </w:pPr>
     <w:r>
@@ -1797,7 +1800,7 @@
         <w:sz w:val="18"/>
         <w:szCs w:val="18"/>
       </w:rPr>
-      <w:t xml:space="preserve">  CMD Consulting Pty Ltd</w:t>
+      <w:t xml:space="preserve">	CMD Consulting Pty Ltd</w:t>
     </w:r>
   </w:p>
 </w:hdr>

</xml_diff>

<commit_message>
Make the right-aligned header the kit default; complete Daniel Millar's address
Moves the right-aligned company name into buildHeader() in the style kit, so
it applies as the CMD house default rather than only to this letter, and
removes the local override from build_letter.js. The logo stays left; the
label sits on the same tab stop the footer uses for the page number.

Completes the addressee from Daniel Millar's signature block: Principal
Metallurgist, Resolute Mining Limited, London office, replacing the earlier
SOMISY Mali address. Adds clearance under the subject rule.

Still two pages. Signatory block remains a placeholder.

Co-Authored-By: Claude Opus 5 <noreply@anthropic.com>
Claude-Session: https://claude.ai/code/session_01DEDRoby29mYZsTUgVwuDAG
</commit_message>
<xml_diff>
--- a/syama-ore-sorting/brief/Syama_Ore_Sorting_Letter.docx
+++ b/syama-ore-sorting/brief/Syama_Ore_Sorting_Letter.docx
@@ -31,7 +31,7 @@
           <w:sz w:val="22"/>
           <w:szCs w:val="22"/>
         </w:rPr>
-        <w:t xml:space="preserve">Daniel Millar</w:t>
+        <w:t xml:space="preserve">Daniel Millar (Pr. Eng)</w:t>
       </w:r>
     </w:p>
     <w:p>
@@ -46,7 +46,7 @@
           <w:sz w:val="22"/>
           <w:szCs w:val="22"/>
         </w:rPr>
-        <w:t xml:space="preserve">[Title]</w:t>
+        <w:t xml:space="preserve">Principal Metallurgist</w:t>
       </w:r>
     </w:p>
     <w:p>
@@ -61,22 +61,7 @@
           <w:sz w:val="22"/>
           <w:szCs w:val="22"/>
         </w:rPr>
-        <w:t xml:space="preserve">Société des Mines de Syama S.A. (SOMISY)</w:t>
-      </w:r>
-    </w:p>
-    <w:p>
-      <w:pPr>
-        <w:keepLines/>
-        <w:spacing w:after="240" w:before="0" w:line="260"/>
-      </w:pPr>
-      <w:r>
-        <w:rPr>
-          <w:rFonts w:ascii="Calibri" w:cs="Calibri" w:eastAsia="Calibri" w:hAnsi="Calibri"/>
-          <w:color w:val="231F20"/>
-          <w:sz w:val="22"/>
-          <w:szCs w:val="22"/>
-        </w:rPr>
-        <w:t xml:space="preserve">Syama Gold Mine, Sikasso Region, Mali</w:t>
+        <w:t xml:space="preserve">Resolute Mining Limited</w:t>
       </w:r>
     </w:p>
     <w:p>
@@ -91,13 +76,43 @@
           <w:sz w:val="22"/>
           <w:szCs w:val="22"/>
         </w:rPr>
+        <w:t xml:space="preserve">2nd Floor, 14 Waterloo Place</w:t>
+      </w:r>
+    </w:p>
+    <w:p>
+      <w:pPr>
+        <w:keepLines/>
+        <w:spacing w:after="230" w:before="0" w:line="260"/>
+      </w:pPr>
+      <w:r>
+        <w:rPr>
+          <w:rFonts w:ascii="Calibri" w:cs="Calibri" w:eastAsia="Calibri" w:hAnsi="Calibri"/>
+          <w:color w:val="231F20"/>
+          <w:sz w:val="22"/>
+          <w:szCs w:val="22"/>
+        </w:rPr>
+        <w:t xml:space="preserve">London SW1Y 4AR, United Kingdom</w:t>
+      </w:r>
+    </w:p>
+    <w:p>
+      <w:pPr>
+        <w:keepLines/>
+        <w:spacing w:after="0" w:before="0" w:line="260"/>
+      </w:pPr>
+      <w:r>
+        <w:rPr>
+          <w:rFonts w:ascii="Calibri" w:cs="Calibri" w:eastAsia="Calibri" w:hAnsi="Calibri"/>
+          <w:color w:val="231F20"/>
+          <w:sz w:val="22"/>
+          <w:szCs w:val="22"/>
+        </w:rPr>
         <w:t xml:space="preserve">Dear Daniel,</w:t>
       </w:r>
     </w:p>
     <w:p>
       <w:pPr>
         <w:pBdr>
-          <w:bottom w:val="single" w:color="60BB46" w:sz="8" w:space="6"/>
+          <w:bottom w:val="single" w:color="60BB46" w:sz="8" w:space="10"/>
         </w:pBdr>
         <w:spacing w:after="200" w:before="240"/>
       </w:pPr>

</xml_diff>

<commit_message>
Sign the covering letter from Mike Daniel, CMD Consulting Pty Ltd
Completes the signatory block. The title line is dropped rather than left as
a placeholder, since none was supplied; the block now reads name over
company. No placeholder fields remain in the letter.

Still two pages.

Co-Authored-By: Claude Opus 5 <noreply@anthropic.com>
Claude-Session: https://claude.ai/code/session_01DEDRoby29mYZsTUgVwuDAG
</commit_message>
<xml_diff>
--- a/syama-ore-sorting/brief/Syama_Ore_Sorting_Letter.docx
+++ b/syama-ore-sorting/brief/Syama_Ore_Sorting_Letter.docx
@@ -1555,23 +1555,7 @@
           <w:sz w:val="22"/>
           <w:szCs w:val="22"/>
         </w:rPr>
-        <w:t xml:space="preserve">[Name]</w:t>
-      </w:r>
-    </w:p>
-    <w:p>
-      <w:pPr>
-        <w:keepNext/>
-        <w:keepLines/>
-        <w:spacing w:after="0" w:before="0" w:line="260"/>
-      </w:pPr>
-      <w:r>
-        <w:rPr>
-          <w:rFonts w:ascii="Calibri" w:cs="Calibri" w:eastAsia="Calibri" w:hAnsi="Calibri"/>
-          <w:color w:val="6B6B6B"/>
-          <w:sz w:val="22"/>
-          <w:szCs w:val="22"/>
-        </w:rPr>
-        <w:t xml:space="preserve">[Title]</w:t>
+        <w:t xml:space="preserve">Mike Daniel</w:t>
       </w:r>
     </w:p>
     <w:p>

</xml_diff>